<commit_message>
fix(infra-4,6,7,9): 2차 적대적 검증 이슈 반영
INFRA-7 (major — allowlist 예외 유형 결합 결함):
- allowlist를 '파일::검사종류::정규식' 3필드로 분리 — number 예외가 AI만능(slop)·
  금지(banned) 위반까지 숨기던 구멍 차단 (salary '성과급' 예외가 '다각적' 위반을
  통과시키던 실증 케이스). self-test에 유형 분리 회귀 케이스 추가
INFRA-4 (test-preambles 검증 강화):
- 죽은 세션 파일(PID 999999) 심고 stale 루프 제거 확인(eea3c6c 회귀 핵심),
  6개 mkdir 디렉토리 assert, JOBSTACK_STATE_DIR 폴백 grep 추가 — 13/13 유지
INFRA-6 (reference docx 정리):
- ats-reference.docx body의 pandoc 샘플 표 잔재 제거 (sectPr만 보존)
INFRA-9 (defense-map 정합):
- 예시 YAML에 '축약본(entry 2개), 실제는 5개+' 주석 명시
- bait_type enum 표기 '갈등판단'→'갈등·판단'으로 spec과 통일

Co-Authored-By: Claude Fable 5 <noreply@anthropic.com>
Claude-Session: https://claude.ai/code/session_01LuZnPszQEBdk2GTKT5iY5P
</commit_message>
<xml_diff>
--- a/templates/export/ats-reference.docx
+++ b/templates/export/ats-reference.docx
@@ -2,317 +2,6 @@
 <file path=word/document.xml><?xml version="1.0" encoding="utf-8"?>
 <w:document xmlns:w="http://schemas.openxmlformats.org/wordprocessingml/2006/main" xmlns:m="http://schemas.openxmlformats.org/officeDocument/2006/math" xmlns:r="http://schemas.openxmlformats.org/officeDocument/2006/relationships" xmlns:o="urn:schemas-microsoft-com:office:office" xmlns:v="urn:schemas-microsoft-com:vml" xmlns:w10="urn:schemas-microsoft-com:office:word" xmlns:a="http://schemas.openxmlformats.org/drawingml/2006/main" xmlns:pic="http://schemas.openxmlformats.org/drawingml/2006/picture" xmlns:wp="http://schemas.openxmlformats.org/drawingml/2006/wordprocessingDrawing">
   <w:body>
-    <w:p>
-      <w:pPr>
-        <w:pStyle w:val="Title"/>
-      </w:pPr>
-      <w:r>
-        <w:t xml:space="preserve">Title</w:t>
-      </w:r>
-    </w:p>
-    <w:p>
-      <w:pPr>
-        <w:pStyle w:val="Subtitle"/>
-      </w:pPr>
-      <w:r>
-        <w:t xml:space="preserve">Subtitle</w:t>
-      </w:r>
-    </w:p>
-    <w:p>
-      <w:pPr>
-        <w:pStyle w:val="Author"/>
-      </w:pPr>
-      <w:r>
-        <w:t xml:space="preserve">Author</w:t>
-      </w:r>
-    </w:p>
-    <w:p>
-      <w:pPr>
-        <w:pStyle w:val="Date"/>
-      </w:pPr>
-      <w:r>
-        <w:t xml:space="preserve">Date</w:t>
-      </w:r>
-    </w:p>
-    <w:p>
-      <w:pPr>
-        <w:pStyle w:val="Abstract"/>
-      </w:pPr>
-      <w:r>
-        <w:t xml:space="preserve">Abstract</w:t>
-      </w:r>
-    </w:p>
-    <w:p>
-      <w:pPr>
-        <w:pStyle w:val="Heading1"/>
-      </w:pPr>
-      <w:bookmarkStart w:id="21" w:name="heading-1"/>
-      <w:r>
-        <w:t xml:space="preserve">Heading 1</w:t>
-      </w:r>
-      <w:bookmarkEnd w:id="21"/>
-    </w:p>
-    <w:p>
-      <w:pPr>
-        <w:pStyle w:val="Heading2"/>
-      </w:pPr>
-      <w:bookmarkStart w:id="22" w:name="heading-2"/>
-      <w:r>
-        <w:t xml:space="preserve">Heading 2</w:t>
-      </w:r>
-      <w:bookmarkEnd w:id="22"/>
-    </w:p>
-    <w:p>
-      <w:pPr>
-        <w:pStyle w:val="Heading3"/>
-      </w:pPr>
-      <w:bookmarkStart w:id="23" w:name="heading-3"/>
-      <w:r>
-        <w:t xml:space="preserve">Heading 3</w:t>
-      </w:r>
-      <w:bookmarkEnd w:id="23"/>
-    </w:p>
-    <w:p>
-      <w:pPr>
-        <w:pStyle w:val="Heading4"/>
-      </w:pPr>
-      <w:bookmarkStart w:id="24" w:name="heading-4"/>
-      <w:r>
-        <w:t xml:space="preserve">Heading 4</w:t>
-      </w:r>
-      <w:bookmarkEnd w:id="24"/>
-    </w:p>
-    <w:p>
-      <w:pPr>
-        <w:pStyle w:val="Heading5"/>
-      </w:pPr>
-      <w:bookmarkStart w:id="25" w:name="heading-5"/>
-      <w:r>
-        <w:t xml:space="preserve">Heading 5</w:t>
-      </w:r>
-      <w:bookmarkEnd w:id="25"/>
-    </w:p>
-    <w:p>
-      <w:pPr>
-        <w:pStyle w:val="Heading6"/>
-      </w:pPr>
-      <w:bookmarkStart w:id="26" w:name="heading-6"/>
-      <w:r>
-        <w:t xml:space="preserve">Heading 6</w:t>
-      </w:r>
-      <w:bookmarkEnd w:id="26"/>
-    </w:p>
-    <w:p>
-      <w:pPr>
-        <w:pStyle w:val="Heading7"/>
-      </w:pPr>
-      <w:bookmarkStart w:id="27" w:name="heading-7"/>
-      <w:r>
-        <w:t xml:space="preserve">Heading 7</w:t>
-      </w:r>
-      <w:bookmarkEnd w:id="27"/>
-    </w:p>
-    <w:p>
-      <w:pPr>
-        <w:pStyle w:val="Heading8"/>
-      </w:pPr>
-      <w:bookmarkStart w:id="28" w:name="heading-8"/>
-      <w:r>
-        <w:t xml:space="preserve">Heading 8</w:t>
-      </w:r>
-      <w:bookmarkEnd w:id="28"/>
-    </w:p>
-    <w:p>
-      <w:pPr>
-        <w:pStyle w:val="Heading9"/>
-      </w:pPr>
-      <w:bookmarkStart w:id="29" w:name="heading-9"/>
-      <w:r>
-        <w:t xml:space="preserve">Heading 9</w:t>
-      </w:r>
-      <w:bookmarkEnd w:id="29"/>
-    </w:p>
-    <w:p>
-      <w:pPr>
-        <w:pStyle w:val="FirstParagraph"/>
-      </w:pPr>
-      <w:r>
-        <w:t xml:space="preserve">First Paragraph.</w:t>
-      </w:r>
-    </w:p>
-    <w:p>
-      <w:pPr>
-        <w:pStyle w:val="BodyText"/>
-      </w:pPr>
-      <w:r>
-        <w:t xml:space="preserve">Body Text. Body Text Char.</w:t>
-      </w:r>
-      <w:r>
-        <w:t xml:space="preserve"> </w:t>
-      </w:r>
-      <w:r>
-        <w:rPr>
-          <w:rStyle w:val="VerbatimChar"/>
-        </w:rPr>
-        <w:t xml:space="preserve">Verbatim Char</w:t>
-      </w:r>
-      <w:r>
-        <w:t xml:space="preserve">.</w:t>
-      </w:r>
-      <w:r>
-        <w:t xml:space="preserve"> </w:t>
-      </w:r>
-      <w:hyperlink r:id="rId30">
-        <w:r>
-          <w:rPr>
-            <w:rStyle w:val="Hyperlink"/>
-          </w:rPr>
-          <w:t xml:space="preserve">Hyperlink</w:t>
-        </w:r>
-      </w:hyperlink>
-      <w:r>
-        <w:t xml:space="preserve">.</w:t>
-      </w:r>
-      <w:r>
-        <w:t xml:space="preserve"> </w:t>
-      </w:r>
-      <w:r>
-        <w:t xml:space="preserve">Footnote.</w:t>
-      </w:r>
-      <w:r>
-        <w:rPr>
-          <w:rStyle w:val="FootnoteReference"/>
-        </w:rPr>
-        <w:footnoteReference w:id="31"/>
-      </w:r>
-    </w:p>
-    <w:p>
-      <w:pPr>
-        <w:pStyle w:val="BlockText"/>
-      </w:pPr>
-      <w:r>
-        <w:t xml:space="preserve">Block Text.</w:t>
-      </w:r>
-    </w:p>
-    <w:p>
-      <w:pPr>
-        <w:pStyle w:val="TableCaption"/>
-      </w:pPr>
-      <w:r>
-        <w:t xml:space="preserve">Table caption.</w:t>
-      </w:r>
-    </w:p>
-    <w:tbl>
-      <w:tblPr>
-        <w:tblStyle w:val="Table"/>
-        <w:tblLook w:firstRow="1"/>
-        <w:tblCaption w:val="Table caption."/>
-      </w:tblPr>
-      <w:tblGrid/>
-      <w:tr>
-        <w:trPr>
-          <w:cnfStyle w:firstRow="1" w:val="100000000000"/>
-        </w:trPr>
-        <w:tc>
-          <w:tcPr>
-            <w:tcBorders>
-              <w:bottom w:val="single"/>
-            </w:tcBorders>
-            <w:vAlign w:val="bottom"/>
-          </w:tcPr>
-          <w:p>
-            <w:pPr>
-              <w:pStyle w:val="Compact"/>
-              <w:jc w:val="left"/>
-            </w:pPr>
-            <w:r>
-              <w:t xml:space="preserve">Table</w:t>
-            </w:r>
-          </w:p>
-        </w:tc>
-        <w:tc>
-          <w:tcPr>
-            <w:tcBorders>
-              <w:bottom w:val="single"/>
-            </w:tcBorders>
-            <w:vAlign w:val="bottom"/>
-          </w:tcPr>
-          <w:p>
-            <w:pPr>
-              <w:pStyle w:val="Compact"/>
-              <w:jc w:val="left"/>
-            </w:pPr>
-            <w:r>
-              <w:t xml:space="preserve">Table</w:t>
-            </w:r>
-          </w:p>
-        </w:tc>
-      </w:tr>
-      <w:tr>
-        <w:tc>
-          <w:p>
-            <w:pPr>
-              <w:pStyle w:val="Compact"/>
-              <w:jc w:val="left"/>
-            </w:pPr>
-            <w:r>
-              <w:t xml:space="preserve">1</w:t>
-            </w:r>
-          </w:p>
-        </w:tc>
-        <w:tc>
-          <w:p>
-            <w:pPr>
-              <w:pStyle w:val="Compact"/>
-              <w:jc w:val="left"/>
-            </w:pPr>
-            <w:r>
-              <w:t xml:space="preserve">2</w:t>
-            </w:r>
-          </w:p>
-        </w:tc>
-      </w:tr>
-    </w:tbl>
-    <w:p>
-      <w:pPr>
-        <w:pStyle w:val="ImageCaption"/>
-      </w:pPr>
-      <w:r>
-        <w:t xml:space="preserve">Image Caption</w:t>
-      </w:r>
-    </w:p>
-    <w:p>
-      <w:pPr>
-        <w:pStyle w:val="DefinitionTerm"/>
-      </w:pPr>
-      <w:r>
-        <w:t xml:space="preserve">DefinitionTerm</w:t>
-      </w:r>
-    </w:p>
-    <w:p>
-      <w:pPr>
-        <w:pStyle w:val="Definition"/>
-      </w:pPr>
-      <w:r>
-        <w:t xml:space="preserve">Definition</w:t>
-      </w:r>
-    </w:p>
-    <w:p>
-      <w:pPr>
-        <w:pStyle w:val="DefinitionTerm"/>
-      </w:pPr>
-      <w:r>
-        <w:t xml:space="preserve">DefinitionTerm</w:t>
-      </w:r>
-    </w:p>
-    <w:p>
-      <w:pPr>
-        <w:pStyle w:val="Definition"/>
-      </w:pPr>
-      <w:r>
-        <w:t xml:space="preserve">Definition</w:t>
-      </w:r>
-    </w:p>
     <w:sectPr>
       <w:footnotePr>
         <w:numRestart w:val="eachSect"/>

</xml_diff>